<commit_message>
docs: finalize setup guide publication status
</commit_message>
<xml_diff>
--- a/docs/NewsLens_AI_Setup_and_Run_Guide.docx
+++ b/docs/NewsLens_AI_Setup_and_Run_Guide.docx
@@ -1772,7 +1772,7 @@
         <w:drawing>
           <wp:inline xmlns:a="http://schemas.openxmlformats.org/drawingml/2006/main" xmlns:pic="http://schemas.openxmlformats.org/drawingml/2006/picture">
             <wp:extent cx="5669280" cy="3543300"/>
-            <wp:docPr id="41" name="Picture 41" descr="Figure S.1. News Desk." title="Figure S.1. News Desk."/>
+            <wp:docPr id="33" name="Picture 33" descr="Figure S.1. News Desk." title="Figure S.1. News Desk."/>
             <wp:cNvGraphicFramePr>
               <a:graphicFrameLocks noChangeAspect="1"/>
             </wp:cNvGraphicFramePr>
@@ -1780,7 +1780,7 @@
               <a:graphicData uri="http://schemas.openxmlformats.org/drawingml/2006/picture">
                 <pic:pic>
                   <pic:nvPicPr>
-                    <pic:cNvPr id="0" name="image.png"/>
+                    <pic:cNvPr id="0" name="01_home.png"/>
                     <pic:cNvPicPr/>
                   </pic:nvPicPr>
                   <pic:blipFill>
@@ -1934,7 +1934,7 @@
         <w:drawing>
           <wp:inline xmlns:a="http://schemas.openxmlformats.org/drawingml/2006/main" xmlns:pic="http://schemas.openxmlformats.org/drawingml/2006/picture">
             <wp:extent cx="5669280" cy="3937000"/>
-            <wp:docPr id="42" name="Picture 42" descr="Figure S.2. Populated article input." title="Figure S.2. Populated article input."/>
+            <wp:docPr id="34" name="Picture 34" descr="Figure S.2. Populated article input." title="Figure S.2. Populated article input."/>
             <wp:cNvGraphicFramePr>
               <a:graphicFrameLocks noChangeAspect="1"/>
             </wp:cNvGraphicFramePr>
@@ -1999,7 +1999,7 @@
         <w:drawing>
           <wp:inline xmlns:a="http://schemas.openxmlformats.org/drawingml/2006/main" xmlns:pic="http://schemas.openxmlformats.org/drawingml/2006/picture">
             <wp:extent cx="5669280" cy="3661410"/>
-            <wp:docPr id="43" name="Picture 43" descr="Figure S.3. Analysis result." title="Figure S.3. Analysis result."/>
+            <wp:docPr id="35" name="Picture 35" descr="Figure S.3. Analysis result." title="Figure S.3. Analysis result."/>
             <wp:cNvGraphicFramePr>
               <a:graphicFrameLocks noChangeAspect="1"/>
             </wp:cNvGraphicFramePr>
@@ -2007,7 +2007,7 @@
               <a:graphicData uri="http://schemas.openxmlformats.org/drawingml/2006/picture">
                 <pic:pic>
                   <pic:nvPicPr>
-                    <pic:cNvPr id="0" name="image.png"/>
+                    <pic:cNvPr id="0" name="03_summary_and_risk_results.png"/>
                     <pic:cNvPicPr/>
                   </pic:nvPicPr>
                   <pic:blipFill>
@@ -2064,7 +2064,7 @@
         <w:drawing>
           <wp:inline xmlns:a="http://schemas.openxmlformats.org/drawingml/2006/main" xmlns:pic="http://schemas.openxmlformats.org/drawingml/2006/picture">
             <wp:extent cx="5669280" cy="3700780"/>
-            <wp:docPr id="44" name="Picture 44" descr="Figure S.4. Explanation and exports." title="Figure S.4. Explanation and exports."/>
+            <wp:docPr id="36" name="Picture 36" descr="Figure S.4. Explanation and exports." title="Figure S.4. Explanation and exports."/>
             <wp:cNvGraphicFramePr>
               <a:graphicFrameLocks noChangeAspect="1"/>
             </wp:cNvGraphicFramePr>
@@ -2072,7 +2072,7 @@
               <a:graphicData uri="http://schemas.openxmlformats.org/drawingml/2006/picture">
                 <pic:pic>
                   <pic:nvPicPr>
-                    <pic:cNvPr id="0" name="image.png"/>
+                    <pic:cNvPr id="0" name="04_explainability_and_downloads.png"/>
                     <pic:cNvPicPr/>
                   </pic:nvPicPr>
                   <pic:blipFill>

</xml_diff>